<commit_message>
Fill office footers on Completion Report, EOT SE/EE, Bill Forwarding Note
- Completion Report / EOT SE / EOT EE: signature footers were blank
  ("____ Circle-___, CMC") — now placeholders that fill from the office
  ({{circle}} Circle-{{cno}}, {{Corporation}}; EOT SE also gets a {{zone}} Zone line).
- Bill Forwarding Note: "Budget Details" centered in the header; footer rebuilt
  so HD sits left with {{circle}} Circle-{{cno}} under it and EE moves to the
  right with {{zone}} Zone under it.
- Bump default-doc version to 8 so existing workspaces refresh these templates.

Co-Authored-By: Claude Opus 4.8 <noreply@anthropic.com>
</commit_message>
<xml_diff>
--- a/resources/bill-forwarding-note-template.docx
+++ b/resources/bill-forwarding-note-template.docx
@@ -24,7 +24,7 @@
     <w:p>
       <w:pPr>
         <w:tabs>
-          <w:tab w:val="left" w:pos="5263"/>
+          <w:tab w:val="center" w:pos="4513"/>
         </w:tabs>
         <w:rPr>
           <w:b/>
@@ -2041,6 +2041,10 @@
     <w:p>
       <w:pPr>
         <w:pStyle w:val="NoSpacing"/>
+        <w:tabs>
+          <w:tab w:val="left" w:pos="2160"/>
+          <w:tab w:val="right" w:pos="9026"/>
+        </w:tabs>
         <w:rPr>
           <w:b/>
         </w:rPr>
@@ -2050,62 +2054,40 @@
           <w:b/>
         </w:rPr>
         <w:tab/>
+        <w:t xml:space="preserve">HD</w:t>
       </w:r>
       <w:r>
         <w:rPr>
           <w:b/>
         </w:rPr>
         <w:tab/>
+        <w:t xml:space="preserve">EE-___</w:t>
+      </w:r>
+    </w:p>
+    <w:p>
+      <w:pPr>
+        <w:pStyle w:val="NoSpacing"/>
+        <w:tabs>
+          <w:tab w:val="left" w:pos="2160"/>
+          <w:tab w:val="right" w:pos="9026"/>
+        </w:tabs>
+        <w:rPr>
+          <w:b/>
+        </w:rPr>
+      </w:pPr>
+      <w:r>
+        <w:rPr>
+          <w:b/>
+        </w:rPr>
+        <w:tab/>
+        <w:t xml:space="preserve">{{circle}} Circle-{{cno}}</w:t>
       </w:r>
       <w:r>
         <w:rPr>
           <w:b/>
         </w:rPr>
         <w:tab/>
-      </w:r>
-      <w:r>
-        <w:rPr>
-          <w:b/>
-        </w:rPr>
-        <w:tab/>
-        <w:t>HD</w:t>
-      </w:r>
-      <w:r>
-        <w:rPr>
-          <w:b/>
-        </w:rPr>
-        <w:tab/>
-      </w:r>
-      <w:r>
-        <w:rPr>
-          <w:b/>
-        </w:rPr>
-        <w:tab/>
-      </w:r>
-      <w:r>
-        <w:rPr>
-          <w:b/>
-        </w:rPr>
-        <w:tab/>
-      </w:r>
-      <w:r>
-        <w:rPr>
-          <w:b/>
-        </w:rPr>
-        <w:tab/>
-      </w:r>
-      <w:r>
-        <w:rPr>
-          <w:b/>
-        </w:rPr>
-        <w:tab/>
-      </w:r>
-      <w:r>
-        <w:rPr>
-          <w:b/>
-        </w:rPr>
-        <w:tab/>
-        <w:t>EE-___</w:t>
+        <w:t xml:space="preserve">{{zone}} Zone</w:t>
       </w:r>
     </w:p>
     <w:sectPr>

</xml_diff>